<commit_message>
BittiBiomi: selkeä aloitus, viisi vaihetta ja yhtenäiset viikko-ohjeet
Aloitus kertoo, mitä tehdään ja miten edetään: pelaajan työnkulun
havainnekuva, viisi numeroitua vaihetta vaihekuvineen, viikkosivun käyttöohje ja
avattavat osiot (rakennekuva työkaluista, repositorysta, pelistä ja releasesta,
dokumenttien tehtävät, vaatimus–ehdotus–päätös, arviointi). Kaikilla 15
työviikolla oma yhteys kokonaisprojektiin ja konkreettinen tavoite. Opiskelijoiden
eteneminen säilyy: 51 tunnusta, järjestys ja 257 osatehtävää ovat ennallaan;
viikot 34–39 merkki merkiltä. Toimeksianto ja suunnitelma erottavat vaatimuksen,
sovitun toteutustavan, ehdotuksen ja oman päätöksen. Uudet viikkokaaviot
kansioista peliin ja datapaketin ketjusta. Lataukset ja odotukset rakennettu
uudelleen.

Co-Authored-By: Claude Opus 5.5 <noreply@anthropic.com>
</commit_message>
<xml_diff>
--- a/downloads/nayton-dokumentointipohjat.docx
+++ b/downloads/nayton-dokumentointipohjat.docx
@@ -4,7 +4,7 @@
   <w:body>
     <w:p>
       <w:pPr>
-        <w:spacing w:after="120" w:before="200"/>
+        <w:spacing w:before="200" w:after="120"/>
       </w:pPr>
       <w:r>
         <w:rPr>
@@ -33,7 +33,7 @@
     <w:p>
       <w:pPr>
         <w:pStyle w:val="Heading1"/>
-        <w:spacing w:after="160" w:before="320"/>
+        <w:spacing w:before="320" w:after="160"/>
       </w:pPr>
       <w:r>
         <w:rPr>
@@ -199,7 +199,6 @@
                 <w:sz w:val="19"/>
                 <w:szCs w:val="19"/>
               </w:rPr>
-              <w:t xml:space="preserve"/>
             </w:r>
           </w:p>
         </w:tc>
@@ -222,7 +221,6 @@
                 <w:sz w:val="19"/>
                 <w:szCs w:val="19"/>
               </w:rPr>
-              <w:t xml:space="preserve"/>
             </w:r>
           </w:p>
         </w:tc>
@@ -270,7 +268,6 @@
                 <w:sz w:val="19"/>
                 <w:szCs w:val="19"/>
               </w:rPr>
-              <w:t xml:space="preserve"/>
             </w:r>
           </w:p>
         </w:tc>
@@ -293,7 +290,6 @@
                 <w:sz w:val="19"/>
                 <w:szCs w:val="19"/>
               </w:rPr>
-              <w:t xml:space="preserve"/>
             </w:r>
           </w:p>
         </w:tc>
@@ -341,7 +337,6 @@
                 <w:sz w:val="19"/>
                 <w:szCs w:val="19"/>
               </w:rPr>
-              <w:t xml:space="preserve"/>
             </w:r>
           </w:p>
         </w:tc>
@@ -364,7 +359,6 @@
                 <w:sz w:val="19"/>
                 <w:szCs w:val="19"/>
               </w:rPr>
-              <w:t xml:space="preserve"/>
             </w:r>
           </w:p>
         </w:tc>
@@ -412,7 +406,6 @@
                 <w:sz w:val="19"/>
                 <w:szCs w:val="19"/>
               </w:rPr>
-              <w:t xml:space="preserve"/>
             </w:r>
           </w:p>
         </w:tc>
@@ -435,7 +428,6 @@
                 <w:sz w:val="19"/>
                 <w:szCs w:val="19"/>
               </w:rPr>
-              <w:t xml:space="preserve"/>
             </w:r>
           </w:p>
         </w:tc>
@@ -483,7 +475,6 @@
                 <w:sz w:val="19"/>
                 <w:szCs w:val="19"/>
               </w:rPr>
-              <w:t xml:space="preserve"/>
             </w:r>
           </w:p>
         </w:tc>
@@ -506,7 +497,6 @@
                 <w:sz w:val="19"/>
                 <w:szCs w:val="19"/>
               </w:rPr>
-              <w:t xml:space="preserve"/>
             </w:r>
           </w:p>
         </w:tc>
@@ -554,7 +544,6 @@
                 <w:sz w:val="19"/>
                 <w:szCs w:val="19"/>
               </w:rPr>
-              <w:t xml:space="preserve"/>
             </w:r>
           </w:p>
         </w:tc>
@@ -577,7 +566,6 @@
                 <w:sz w:val="19"/>
                 <w:szCs w:val="19"/>
               </w:rPr>
-              <w:t xml:space="preserve"/>
             </w:r>
           </w:p>
         </w:tc>
@@ -625,7 +613,6 @@
                 <w:sz w:val="19"/>
                 <w:szCs w:val="19"/>
               </w:rPr>
-              <w:t xml:space="preserve"/>
             </w:r>
           </w:p>
         </w:tc>
@@ -648,7 +635,6 @@
                 <w:sz w:val="19"/>
                 <w:szCs w:val="19"/>
               </w:rPr>
-              <w:t xml:space="preserve"/>
             </w:r>
           </w:p>
         </w:tc>
@@ -696,7 +682,6 @@
                 <w:sz w:val="19"/>
                 <w:szCs w:val="19"/>
               </w:rPr>
-              <w:t xml:space="preserve"/>
             </w:r>
           </w:p>
         </w:tc>
@@ -719,7 +704,6 @@
                 <w:sz w:val="19"/>
                 <w:szCs w:val="19"/>
               </w:rPr>
-              <w:t xml:space="preserve"/>
             </w:r>
           </w:p>
         </w:tc>
@@ -733,7 +717,7 @@
     <w:p>
       <w:pPr>
         <w:pStyle w:val="Heading1"/>
-        <w:spacing w:after="160" w:before="320"/>
+        <w:spacing w:before="320" w:after="160"/>
       </w:pPr>
       <w:r>
         <w:rPr>
@@ -941,7 +925,7 @@
     <w:p>
       <w:pPr>
         <w:pStyle w:val="Heading1"/>
-        <w:spacing w:after="160" w:before="320"/>
+        <w:spacing w:before="320" w:after="160"/>
       </w:pPr>
       <w:r>
         <w:rPr>
@@ -1014,7 +998,6 @@
                 <w:sz w:val="19"/>
                 <w:szCs w:val="19"/>
               </w:rPr>
-              <w:t xml:space="preserve"/>
             </w:r>
           </w:p>
         </w:tc>
@@ -1065,7 +1048,6 @@
                 <w:sz w:val="19"/>
                 <w:szCs w:val="19"/>
               </w:rPr>
-              <w:t xml:space="preserve"/>
             </w:r>
           </w:p>
         </w:tc>
@@ -1116,7 +1098,6 @@
                 <w:sz w:val="19"/>
                 <w:szCs w:val="19"/>
               </w:rPr>
-              <w:t xml:space="preserve"/>
             </w:r>
           </w:p>
         </w:tc>
@@ -1167,7 +1148,6 @@
                 <w:sz w:val="19"/>
                 <w:szCs w:val="19"/>
               </w:rPr>
-              <w:t xml:space="preserve"/>
             </w:r>
           </w:p>
         </w:tc>
@@ -1218,7 +1198,6 @@
                 <w:sz w:val="19"/>
                 <w:szCs w:val="19"/>
               </w:rPr>
-              <w:t xml:space="preserve"/>
             </w:r>
           </w:p>
         </w:tc>
@@ -1269,7 +1248,6 @@
                 <w:sz w:val="19"/>
                 <w:szCs w:val="19"/>
               </w:rPr>
-              <w:t xml:space="preserve"/>
             </w:r>
           </w:p>
         </w:tc>
@@ -1298,7 +1276,7 @@
     <w:p>
       <w:pPr>
         <w:pStyle w:val="Heading1"/>
-        <w:spacing w:after="160" w:before="320"/>
+        <w:spacing w:before="320" w:after="160"/>
       </w:pPr>
       <w:r>
         <w:rPr>
@@ -1533,7 +1511,6 @@
                 <w:sz w:val="19"/>
                 <w:szCs w:val="19"/>
               </w:rPr>
-              <w:t xml:space="preserve"/>
             </w:r>
           </w:p>
         </w:tc>
@@ -1556,7 +1533,6 @@
                 <w:sz w:val="19"/>
                 <w:szCs w:val="19"/>
               </w:rPr>
-              <w:t xml:space="preserve"/>
             </w:r>
           </w:p>
         </w:tc>
@@ -1579,7 +1555,6 @@
                 <w:sz w:val="19"/>
                 <w:szCs w:val="19"/>
               </w:rPr>
-              <w:t xml:space="preserve"/>
             </w:r>
           </w:p>
         </w:tc>
@@ -1602,7 +1577,6 @@
                 <w:sz w:val="19"/>
                 <w:szCs w:val="19"/>
               </w:rPr>
-              <w:t xml:space="preserve"/>
             </w:r>
           </w:p>
         </w:tc>
@@ -1625,7 +1599,6 @@
                 <w:sz w:val="19"/>
                 <w:szCs w:val="19"/>
               </w:rPr>
-              <w:t xml:space="preserve"/>
             </w:r>
           </w:p>
         </w:tc>
@@ -1673,7 +1646,6 @@
                 <w:sz w:val="19"/>
                 <w:szCs w:val="19"/>
               </w:rPr>
-              <w:t xml:space="preserve"/>
             </w:r>
           </w:p>
         </w:tc>
@@ -1696,7 +1668,6 @@
                 <w:sz w:val="19"/>
                 <w:szCs w:val="19"/>
               </w:rPr>
-              <w:t xml:space="preserve"/>
             </w:r>
           </w:p>
         </w:tc>
@@ -1719,7 +1690,6 @@
                 <w:sz w:val="19"/>
                 <w:szCs w:val="19"/>
               </w:rPr>
-              <w:t xml:space="preserve"/>
             </w:r>
           </w:p>
         </w:tc>
@@ -1742,7 +1712,6 @@
                 <w:sz w:val="19"/>
                 <w:szCs w:val="19"/>
               </w:rPr>
-              <w:t xml:space="preserve"/>
             </w:r>
           </w:p>
         </w:tc>
@@ -1765,7 +1734,6 @@
                 <w:sz w:val="19"/>
                 <w:szCs w:val="19"/>
               </w:rPr>
-              <w:t xml:space="preserve"/>
             </w:r>
           </w:p>
         </w:tc>
@@ -1813,7 +1781,6 @@
                 <w:sz w:val="19"/>
                 <w:szCs w:val="19"/>
               </w:rPr>
-              <w:t xml:space="preserve"/>
             </w:r>
           </w:p>
         </w:tc>
@@ -1836,7 +1803,6 @@
                 <w:sz w:val="19"/>
                 <w:szCs w:val="19"/>
               </w:rPr>
-              <w:t xml:space="preserve"/>
             </w:r>
           </w:p>
         </w:tc>
@@ -1859,7 +1825,6 @@
                 <w:sz w:val="19"/>
                 <w:szCs w:val="19"/>
               </w:rPr>
-              <w:t xml:space="preserve"/>
             </w:r>
           </w:p>
         </w:tc>
@@ -1882,7 +1847,6 @@
                 <w:sz w:val="19"/>
                 <w:szCs w:val="19"/>
               </w:rPr>
-              <w:t xml:space="preserve"/>
             </w:r>
           </w:p>
         </w:tc>
@@ -1905,7 +1869,6 @@
                 <w:sz w:val="19"/>
                 <w:szCs w:val="19"/>
               </w:rPr>
-              <w:t xml:space="preserve"/>
             </w:r>
           </w:p>
         </w:tc>
@@ -1953,7 +1916,6 @@
                 <w:sz w:val="19"/>
                 <w:szCs w:val="19"/>
               </w:rPr>
-              <w:t xml:space="preserve"/>
             </w:r>
           </w:p>
         </w:tc>
@@ -1976,7 +1938,6 @@
                 <w:sz w:val="19"/>
                 <w:szCs w:val="19"/>
               </w:rPr>
-              <w:t xml:space="preserve"/>
             </w:r>
           </w:p>
         </w:tc>
@@ -1999,7 +1960,6 @@
                 <w:sz w:val="19"/>
                 <w:szCs w:val="19"/>
               </w:rPr>
-              <w:t xml:space="preserve"/>
             </w:r>
           </w:p>
         </w:tc>
@@ -2022,7 +1982,6 @@
                 <w:sz w:val="19"/>
                 <w:szCs w:val="19"/>
               </w:rPr>
-              <w:t xml:space="preserve"/>
             </w:r>
           </w:p>
         </w:tc>
@@ -2045,7 +2004,6 @@
                 <w:sz w:val="19"/>
                 <w:szCs w:val="19"/>
               </w:rPr>
-              <w:t xml:space="preserve"/>
             </w:r>
           </w:p>
         </w:tc>
@@ -2093,7 +2051,6 @@
                 <w:sz w:val="19"/>
                 <w:szCs w:val="19"/>
               </w:rPr>
-              <w:t xml:space="preserve"/>
             </w:r>
           </w:p>
         </w:tc>
@@ -2116,7 +2073,6 @@
                 <w:sz w:val="19"/>
                 <w:szCs w:val="19"/>
               </w:rPr>
-              <w:t xml:space="preserve"/>
             </w:r>
           </w:p>
         </w:tc>
@@ -2139,7 +2095,6 @@
                 <w:sz w:val="19"/>
                 <w:szCs w:val="19"/>
               </w:rPr>
-              <w:t xml:space="preserve"/>
             </w:r>
           </w:p>
         </w:tc>
@@ -2162,7 +2117,6 @@
                 <w:sz w:val="19"/>
                 <w:szCs w:val="19"/>
               </w:rPr>
-              <w:t xml:space="preserve"/>
             </w:r>
           </w:p>
         </w:tc>
@@ -2185,7 +2139,6 @@
                 <w:sz w:val="19"/>
                 <w:szCs w:val="19"/>
               </w:rPr>
-              <w:t xml:space="preserve"/>
             </w:r>
           </w:p>
         </w:tc>
@@ -2233,7 +2186,6 @@
                 <w:sz w:val="19"/>
                 <w:szCs w:val="19"/>
               </w:rPr>
-              <w:t xml:space="preserve"/>
             </w:r>
           </w:p>
         </w:tc>
@@ -2256,7 +2208,6 @@
                 <w:sz w:val="19"/>
                 <w:szCs w:val="19"/>
               </w:rPr>
-              <w:t xml:space="preserve"/>
             </w:r>
           </w:p>
         </w:tc>
@@ -2279,7 +2230,6 @@
                 <w:sz w:val="19"/>
                 <w:szCs w:val="19"/>
               </w:rPr>
-              <w:t xml:space="preserve"/>
             </w:r>
           </w:p>
         </w:tc>
@@ -2302,7 +2252,6 @@
                 <w:sz w:val="19"/>
                 <w:szCs w:val="19"/>
               </w:rPr>
-              <w:t xml:space="preserve"/>
             </w:r>
           </w:p>
         </w:tc>
@@ -2325,7 +2274,6 @@
                 <w:sz w:val="19"/>
                 <w:szCs w:val="19"/>
               </w:rPr>
-              <w:t xml:space="preserve"/>
             </w:r>
           </w:p>
         </w:tc>
@@ -2373,7 +2321,6 @@
                 <w:sz w:val="19"/>
                 <w:szCs w:val="19"/>
               </w:rPr>
-              <w:t xml:space="preserve"/>
             </w:r>
           </w:p>
         </w:tc>
@@ -2396,7 +2343,6 @@
                 <w:sz w:val="19"/>
                 <w:szCs w:val="19"/>
               </w:rPr>
-              <w:t xml:space="preserve"/>
             </w:r>
           </w:p>
         </w:tc>
@@ -2419,7 +2365,6 @@
                 <w:sz w:val="19"/>
                 <w:szCs w:val="19"/>
               </w:rPr>
-              <w:t xml:space="preserve"/>
             </w:r>
           </w:p>
         </w:tc>
@@ -2442,7 +2387,6 @@
                 <w:sz w:val="19"/>
                 <w:szCs w:val="19"/>
               </w:rPr>
-              <w:t xml:space="preserve"/>
             </w:r>
           </w:p>
         </w:tc>
@@ -2465,7 +2409,6 @@
                 <w:sz w:val="19"/>
                 <w:szCs w:val="19"/>
               </w:rPr>
-              <w:t xml:space="preserve"/>
             </w:r>
           </w:p>
         </w:tc>
@@ -2513,7 +2456,6 @@
                 <w:sz w:val="19"/>
                 <w:szCs w:val="19"/>
               </w:rPr>
-              <w:t xml:space="preserve"/>
             </w:r>
           </w:p>
         </w:tc>
@@ -2536,7 +2478,6 @@
                 <w:sz w:val="19"/>
                 <w:szCs w:val="19"/>
               </w:rPr>
-              <w:t xml:space="preserve"/>
             </w:r>
           </w:p>
         </w:tc>
@@ -2559,7 +2500,6 @@
                 <w:sz w:val="19"/>
                 <w:szCs w:val="19"/>
               </w:rPr>
-              <w:t xml:space="preserve"/>
             </w:r>
           </w:p>
         </w:tc>
@@ -2582,7 +2522,6 @@
                 <w:sz w:val="19"/>
                 <w:szCs w:val="19"/>
               </w:rPr>
-              <w:t xml:space="preserve"/>
             </w:r>
           </w:p>
         </w:tc>
@@ -2605,7 +2544,6 @@
                 <w:sz w:val="19"/>
                 <w:szCs w:val="19"/>
               </w:rPr>
-              <w:t xml:space="preserve"/>
             </w:r>
           </w:p>
         </w:tc>
@@ -2653,7 +2591,6 @@
                 <w:sz w:val="19"/>
                 <w:szCs w:val="19"/>
               </w:rPr>
-              <w:t xml:space="preserve"/>
             </w:r>
           </w:p>
         </w:tc>
@@ -2676,7 +2613,6 @@
                 <w:sz w:val="19"/>
                 <w:szCs w:val="19"/>
               </w:rPr>
-              <w:t xml:space="preserve"/>
             </w:r>
           </w:p>
         </w:tc>
@@ -2699,7 +2635,6 @@
                 <w:sz w:val="19"/>
                 <w:szCs w:val="19"/>
               </w:rPr>
-              <w:t xml:space="preserve"/>
             </w:r>
           </w:p>
         </w:tc>
@@ -2722,7 +2657,6 @@
                 <w:sz w:val="19"/>
                 <w:szCs w:val="19"/>
               </w:rPr>
-              <w:t xml:space="preserve"/>
             </w:r>
           </w:p>
         </w:tc>
@@ -2745,7 +2679,6 @@
                 <w:sz w:val="19"/>
                 <w:szCs w:val="19"/>
               </w:rPr>
-              <w:t xml:space="preserve"/>
             </w:r>
           </w:p>
         </w:tc>
@@ -2793,7 +2726,6 @@
                 <w:sz w:val="19"/>
                 <w:szCs w:val="19"/>
               </w:rPr>
-              <w:t xml:space="preserve"/>
             </w:r>
           </w:p>
         </w:tc>
@@ -2816,7 +2748,6 @@
                 <w:sz w:val="19"/>
                 <w:szCs w:val="19"/>
               </w:rPr>
-              <w:t xml:space="preserve"/>
             </w:r>
           </w:p>
         </w:tc>
@@ -2839,7 +2770,6 @@
                 <w:sz w:val="19"/>
                 <w:szCs w:val="19"/>
               </w:rPr>
-              <w:t xml:space="preserve"/>
             </w:r>
           </w:p>
         </w:tc>
@@ -2862,7 +2792,6 @@
                 <w:sz w:val="19"/>
                 <w:szCs w:val="19"/>
               </w:rPr>
-              <w:t xml:space="preserve"/>
             </w:r>
           </w:p>
         </w:tc>
@@ -2885,7 +2814,6 @@
                 <w:sz w:val="19"/>
                 <w:szCs w:val="19"/>
               </w:rPr>
-              <w:t xml:space="preserve"/>
             </w:r>
           </w:p>
         </w:tc>
@@ -2933,7 +2861,6 @@
                 <w:sz w:val="19"/>
                 <w:szCs w:val="19"/>
               </w:rPr>
-              <w:t xml:space="preserve"/>
             </w:r>
           </w:p>
         </w:tc>
@@ -2956,7 +2883,6 @@
                 <w:sz w:val="19"/>
                 <w:szCs w:val="19"/>
               </w:rPr>
-              <w:t xml:space="preserve"/>
             </w:r>
           </w:p>
         </w:tc>
@@ -2979,7 +2905,6 @@
                 <w:sz w:val="19"/>
                 <w:szCs w:val="19"/>
               </w:rPr>
-              <w:t xml:space="preserve"/>
             </w:r>
           </w:p>
         </w:tc>
@@ -3002,7 +2927,6 @@
                 <w:sz w:val="19"/>
                 <w:szCs w:val="19"/>
               </w:rPr>
-              <w:t xml:space="preserve"/>
             </w:r>
           </w:p>
         </w:tc>
@@ -3025,7 +2949,6 @@
                 <w:sz w:val="19"/>
                 <w:szCs w:val="19"/>
               </w:rPr>
-              <w:t xml:space="preserve"/>
             </w:r>
           </w:p>
         </w:tc>
@@ -3073,7 +2996,6 @@
                 <w:sz w:val="19"/>
                 <w:szCs w:val="19"/>
               </w:rPr>
-              <w:t xml:space="preserve"/>
             </w:r>
           </w:p>
         </w:tc>
@@ -3096,7 +3018,6 @@
                 <w:sz w:val="19"/>
                 <w:szCs w:val="19"/>
               </w:rPr>
-              <w:t xml:space="preserve"/>
             </w:r>
           </w:p>
         </w:tc>
@@ -3119,7 +3040,6 @@
                 <w:sz w:val="19"/>
                 <w:szCs w:val="19"/>
               </w:rPr>
-              <w:t xml:space="preserve"/>
             </w:r>
           </w:p>
         </w:tc>
@@ -3142,7 +3062,6 @@
                 <w:sz w:val="19"/>
                 <w:szCs w:val="19"/>
               </w:rPr>
-              <w:t xml:space="preserve"/>
             </w:r>
           </w:p>
         </w:tc>
@@ -3165,7 +3084,6 @@
                 <w:sz w:val="19"/>
                 <w:szCs w:val="19"/>
               </w:rPr>
-              <w:t xml:space="preserve"/>
             </w:r>
           </w:p>
         </w:tc>
@@ -3183,7 +3101,7 @@
           <w:sz w:val="21"/>
           <w:szCs w:val="21"/>
         </w:rPr>
-        <w:t xml:space="preserve">Luokat: T01–T04 normaali käyttö · T05–T08 rajat · loput virhetilanteet. Kirjoita odotus ennen testiajoa.</w:t>
+        <w:t xml:space="preserve">Merkitse jokaiselle testitapaukselle luokka: normaali käyttö, raja tai virhetilanne. Kirjoita odotus ennen testiajoa.</w:t>
       </w:r>
     </w:p>
     <w:p>
@@ -3194,7 +3112,7 @@
     <w:p>
       <w:pPr>
         <w:pStyle w:val="Heading1"/>
-        <w:spacing w:after="160" w:before="320"/>
+        <w:spacing w:before="320" w:after="160"/>
       </w:pPr>
       <w:r>
         <w:rPr>
@@ -3375,7 +3293,7 @@
     <w:p>
       <w:pPr>
         <w:pStyle w:val="Heading1"/>
-        <w:spacing w:after="160" w:before="320"/>
+        <w:spacing w:before="320" w:after="160"/>
       </w:pPr>
       <w:r>
         <w:rPr>
@@ -3518,7 +3436,6 @@
                 <w:sz w:val="19"/>
                 <w:szCs w:val="19"/>
               </w:rPr>
-              <w:t xml:space="preserve"/>
             </w:r>
           </w:p>
         </w:tc>
@@ -3541,7 +3458,6 @@
                 <w:sz w:val="19"/>
                 <w:szCs w:val="19"/>
               </w:rPr>
-              <w:t xml:space="preserve"/>
             </w:r>
           </w:p>
         </w:tc>
@@ -3564,7 +3480,6 @@
                 <w:sz w:val="19"/>
                 <w:szCs w:val="19"/>
               </w:rPr>
-              <w:t xml:space="preserve"/>
             </w:r>
           </w:p>
         </w:tc>
@@ -3589,7 +3504,6 @@
                 <w:sz w:val="19"/>
                 <w:szCs w:val="19"/>
               </w:rPr>
-              <w:t xml:space="preserve"/>
             </w:r>
           </w:p>
         </w:tc>
@@ -3612,7 +3526,6 @@
                 <w:sz w:val="19"/>
                 <w:szCs w:val="19"/>
               </w:rPr>
-              <w:t xml:space="preserve"/>
             </w:r>
           </w:p>
         </w:tc>
@@ -3635,7 +3548,6 @@
                 <w:sz w:val="19"/>
                 <w:szCs w:val="19"/>
               </w:rPr>
-              <w:t xml:space="preserve"/>
             </w:r>
           </w:p>
         </w:tc>
@@ -3660,7 +3572,6 @@
                 <w:sz w:val="19"/>
                 <w:szCs w:val="19"/>
               </w:rPr>
-              <w:t xml:space="preserve"/>
             </w:r>
           </w:p>
         </w:tc>
@@ -3683,7 +3594,6 @@
                 <w:sz w:val="19"/>
                 <w:szCs w:val="19"/>
               </w:rPr>
-              <w:t xml:space="preserve"/>
             </w:r>
           </w:p>
         </w:tc>
@@ -3706,7 +3616,6 @@
                 <w:sz w:val="19"/>
                 <w:szCs w:val="19"/>
               </w:rPr>
-              <w:t xml:space="preserve"/>
             </w:r>
           </w:p>
         </w:tc>
@@ -3731,7 +3640,6 @@
                 <w:sz w:val="19"/>
                 <w:szCs w:val="19"/>
               </w:rPr>
-              <w:t xml:space="preserve"/>
             </w:r>
           </w:p>
         </w:tc>
@@ -3754,7 +3662,6 @@
                 <w:sz w:val="19"/>
                 <w:szCs w:val="19"/>
               </w:rPr>
-              <w:t xml:space="preserve"/>
             </w:r>
           </w:p>
         </w:tc>
@@ -3777,7 +3684,6 @@
                 <w:sz w:val="19"/>
                 <w:szCs w:val="19"/>
               </w:rPr>
-              <w:t xml:space="preserve"/>
             </w:r>
           </w:p>
         </w:tc>
@@ -3802,7 +3708,6 @@
                 <w:sz w:val="19"/>
                 <w:szCs w:val="19"/>
               </w:rPr>
-              <w:t xml:space="preserve"/>
             </w:r>
           </w:p>
         </w:tc>
@@ -3825,7 +3730,6 @@
                 <w:sz w:val="19"/>
                 <w:szCs w:val="19"/>
               </w:rPr>
-              <w:t xml:space="preserve"/>
             </w:r>
           </w:p>
         </w:tc>
@@ -3848,7 +3752,6 @@
                 <w:sz w:val="19"/>
                 <w:szCs w:val="19"/>
               </w:rPr>
-              <w:t xml:space="preserve"/>
             </w:r>
           </w:p>
         </w:tc>
@@ -3873,7 +3776,6 @@
                 <w:sz w:val="19"/>
                 <w:szCs w:val="19"/>
               </w:rPr>
-              <w:t xml:space="preserve"/>
             </w:r>
           </w:p>
         </w:tc>
@@ -3896,7 +3798,6 @@
                 <w:sz w:val="19"/>
                 <w:szCs w:val="19"/>
               </w:rPr>
-              <w:t xml:space="preserve"/>
             </w:r>
           </w:p>
         </w:tc>
@@ -3919,7 +3820,6 @@
                 <w:sz w:val="19"/>
                 <w:szCs w:val="19"/>
               </w:rPr>
-              <w:t xml:space="preserve"/>
             </w:r>
           </w:p>
         </w:tc>
@@ -3944,7 +3844,6 @@
                 <w:sz w:val="19"/>
                 <w:szCs w:val="19"/>
               </w:rPr>
-              <w:t xml:space="preserve"/>
             </w:r>
           </w:p>
         </w:tc>
@@ -3967,7 +3866,6 @@
                 <w:sz w:val="19"/>
                 <w:szCs w:val="19"/>
               </w:rPr>
-              <w:t xml:space="preserve"/>
             </w:r>
           </w:p>
         </w:tc>
@@ -3990,7 +3888,6 @@
                 <w:sz w:val="19"/>
                 <w:szCs w:val="19"/>
               </w:rPr>
-              <w:t xml:space="preserve"/>
             </w:r>
           </w:p>
         </w:tc>
@@ -4015,7 +3912,6 @@
                 <w:sz w:val="19"/>
                 <w:szCs w:val="19"/>
               </w:rPr>
-              <w:t xml:space="preserve"/>
             </w:r>
           </w:p>
         </w:tc>
@@ -4038,7 +3934,6 @@
                 <w:sz w:val="19"/>
                 <w:szCs w:val="19"/>
               </w:rPr>
-              <w:t xml:space="preserve"/>
             </w:r>
           </w:p>
         </w:tc>
@@ -4061,7 +3956,6 @@
                 <w:sz w:val="19"/>
                 <w:szCs w:val="19"/>
               </w:rPr>
-              <w:t xml:space="preserve"/>
             </w:r>
           </w:p>
         </w:tc>
@@ -4090,7 +3984,7 @@
     <w:p>
       <w:pPr>
         <w:pStyle w:val="Heading1"/>
-        <w:spacing w:after="160" w:before="320"/>
+        <w:spacing w:before="320" w:after="160"/>
       </w:pPr>
       <w:r>
         <w:rPr>
@@ -4261,7 +4155,6 @@
                 <w:sz w:val="19"/>
                 <w:szCs w:val="19"/>
               </w:rPr>
-              <w:t xml:space="preserve"/>
             </w:r>
           </w:p>
         </w:tc>
@@ -4284,7 +4177,6 @@
                 <w:sz w:val="19"/>
                 <w:szCs w:val="19"/>
               </w:rPr>
-              <w:t xml:space="preserve"/>
             </w:r>
           </w:p>
         </w:tc>
@@ -4307,7 +4199,6 @@
                 <w:sz w:val="19"/>
                 <w:szCs w:val="19"/>
               </w:rPr>
-              <w:t xml:space="preserve"/>
             </w:r>
           </w:p>
         </w:tc>
@@ -4330,7 +4221,6 @@
                 <w:sz w:val="19"/>
                 <w:szCs w:val="19"/>
               </w:rPr>
-              <w:t xml:space="preserve"/>
             </w:r>
           </w:p>
         </w:tc>
@@ -4355,7 +4245,6 @@
                 <w:sz w:val="19"/>
                 <w:szCs w:val="19"/>
               </w:rPr>
-              <w:t xml:space="preserve"/>
             </w:r>
           </w:p>
         </w:tc>
@@ -4378,7 +4267,6 @@
                 <w:sz w:val="19"/>
                 <w:szCs w:val="19"/>
               </w:rPr>
-              <w:t xml:space="preserve"/>
             </w:r>
           </w:p>
         </w:tc>
@@ -4401,7 +4289,6 @@
                 <w:sz w:val="19"/>
                 <w:szCs w:val="19"/>
               </w:rPr>
-              <w:t xml:space="preserve"/>
             </w:r>
           </w:p>
         </w:tc>
@@ -4424,7 +4311,6 @@
                 <w:sz w:val="19"/>
                 <w:szCs w:val="19"/>
               </w:rPr>
-              <w:t xml:space="preserve"/>
             </w:r>
           </w:p>
         </w:tc>
@@ -4449,7 +4335,6 @@
                 <w:sz w:val="19"/>
                 <w:szCs w:val="19"/>
               </w:rPr>
-              <w:t xml:space="preserve"/>
             </w:r>
           </w:p>
         </w:tc>
@@ -4472,7 +4357,6 @@
                 <w:sz w:val="19"/>
                 <w:szCs w:val="19"/>
               </w:rPr>
-              <w:t xml:space="preserve"/>
             </w:r>
           </w:p>
         </w:tc>
@@ -4495,7 +4379,6 @@
                 <w:sz w:val="19"/>
                 <w:szCs w:val="19"/>
               </w:rPr>
-              <w:t xml:space="preserve"/>
             </w:r>
           </w:p>
         </w:tc>
@@ -4518,7 +4401,6 @@
                 <w:sz w:val="19"/>
                 <w:szCs w:val="19"/>
               </w:rPr>
-              <w:t xml:space="preserve"/>
             </w:r>
           </w:p>
         </w:tc>
@@ -4543,7 +4425,6 @@
                 <w:sz w:val="19"/>
                 <w:szCs w:val="19"/>
               </w:rPr>
-              <w:t xml:space="preserve"/>
             </w:r>
           </w:p>
         </w:tc>
@@ -4566,7 +4447,6 @@
                 <w:sz w:val="19"/>
                 <w:szCs w:val="19"/>
               </w:rPr>
-              <w:t xml:space="preserve"/>
             </w:r>
           </w:p>
         </w:tc>
@@ -4589,7 +4469,6 @@
                 <w:sz w:val="19"/>
                 <w:szCs w:val="19"/>
               </w:rPr>
-              <w:t xml:space="preserve"/>
             </w:r>
           </w:p>
         </w:tc>
@@ -4612,7 +4491,6 @@
                 <w:sz w:val="19"/>
                 <w:szCs w:val="19"/>
               </w:rPr>
-              <w:t xml:space="preserve"/>
             </w:r>
           </w:p>
         </w:tc>
@@ -4637,7 +4515,6 @@
                 <w:sz w:val="19"/>
                 <w:szCs w:val="19"/>
               </w:rPr>
-              <w:t xml:space="preserve"/>
             </w:r>
           </w:p>
         </w:tc>
@@ -4660,7 +4537,6 @@
                 <w:sz w:val="19"/>
                 <w:szCs w:val="19"/>
               </w:rPr>
-              <w:t xml:space="preserve"/>
             </w:r>
           </w:p>
         </w:tc>
@@ -4683,7 +4559,6 @@
                 <w:sz w:val="19"/>
                 <w:szCs w:val="19"/>
               </w:rPr>
-              <w:t xml:space="preserve"/>
             </w:r>
           </w:p>
         </w:tc>
@@ -4706,7 +4581,6 @@
                 <w:sz w:val="19"/>
                 <w:szCs w:val="19"/>
               </w:rPr>
-              <w:t xml:space="preserve"/>
             </w:r>
           </w:p>
         </w:tc>
@@ -4731,7 +4605,6 @@
                 <w:sz w:val="19"/>
                 <w:szCs w:val="19"/>
               </w:rPr>
-              <w:t xml:space="preserve"/>
             </w:r>
           </w:p>
         </w:tc>
@@ -4754,7 +4627,6 @@
                 <w:sz w:val="19"/>
                 <w:szCs w:val="19"/>
               </w:rPr>
-              <w:t xml:space="preserve"/>
             </w:r>
           </w:p>
         </w:tc>
@@ -4777,7 +4649,6 @@
                 <w:sz w:val="19"/>
                 <w:szCs w:val="19"/>
               </w:rPr>
-              <w:t xml:space="preserve"/>
             </w:r>
           </w:p>
         </w:tc>
@@ -4800,7 +4671,6 @@
                 <w:sz w:val="19"/>
                 <w:szCs w:val="19"/>
               </w:rPr>
-              <w:t xml:space="preserve"/>
             </w:r>
           </w:p>
         </w:tc>
@@ -4833,43 +4703,6 @@
 
 <file path=word/comments.xml><?xml version="1.0" encoding="utf-8"?>
 <w:comments xmlns:cx="http://schemas.microsoft.com/office/drawing/2014/chartex" xmlns:cx1="http://schemas.microsoft.com/office/drawing/2015/9/8/chartex" xmlns:cx2="http://schemas.microsoft.com/office/drawing/2015/10/21/chartex" xmlns:cx3="http://schemas.microsoft.com/office/drawing/2016/5/9/chartex" xmlns:cx4="http://schemas.microsoft.com/office/drawing/2016/5/10/chartex" xmlns:cx5="http://schemas.microsoft.com/office/drawing/2016/5/11/chartex" xmlns:cx6="http://schemas.microsoft.com/office/drawing/2016/5/12/chartex" xmlns:cx7="http://schemas.microsoft.com/office/drawing/2016/5/13/chartex" xmlns:cx8="http://schemas.microsoft.com/office/drawing/2016/5/14/chartex" xmlns:mc="http://schemas.openxmlformats.org/markup-compatibility/2006" xmlns:aink="http://schemas.microsoft.com/office/drawing/2016/ink" xmlns:am3d="http://schemas.microsoft.com/office/drawing/2017/model3d" xmlns:o="urn:schemas-microsoft-com:office:office" xmlns:r="http://schemas.openxmlformats.org/officeDocument/2006/relationships" xmlns:m="http://schemas.openxmlformats.org/officeDocument/2006/math" xmlns:v="urn:schemas-microsoft-com:vml" xmlns:wp14="http://schemas.microsoft.com/office/word/2010/wordprocessingDrawing" xmlns:wp="http://schemas.openxmlformats.org/drawingml/2006/wordprocessingDrawing" xmlns:w10="urn:schemas-microsoft-com:office:word" xmlns:w="http://schemas.openxmlformats.org/wordprocessingml/2006/main" xmlns:w14="http://schemas.microsoft.com/office/word/2010/wordml" xmlns:w15="http://schemas.microsoft.com/office/word/2012/wordml" xmlns:w16cex="http://schemas.microsoft.com/office/word/2018/wordml/cex" xmlns:w16cid="http://schemas.microsoft.com/office/word/2016/wordml/cid" xmlns:w16="http://schemas.microsoft.com/office/word/2018/wordml" xmlns:w16sdtdh="http://schemas.microsoft.com/office/word/2020/wordml/sdtdatahash" xmlns:w16se="http://schemas.microsoft.com/office/word/2015/wordml/symex" xmlns:wpg="http://schemas.microsoft.com/office/word/2010/wordprocessingGroup" xmlns:wpi="http://schemas.microsoft.com/office/word/2010/wordprocessingInk" xmlns:wne="http://schemas.microsoft.com/office/word/2006/wordml" xmlns:wps="http://schemas.microsoft.com/office/word/2010/wordprocessingShape"/>
-</file>
-
-<file path=word/endnotes.xml><?xml version="1.0" encoding="utf-8"?>
-<w:endnotes xmlns:wpc="http://schemas.microsoft.com/office/word/2010/wordprocessingCanvas" xmlns:mc="http://schemas.openxmlformats.org/markup-compatibility/2006" xmlns:o="urn:schemas-microsoft-com:office:office" xmlns:r="http://schemas.openxmlformats.org/officeDocument/2006/relationships" xmlns:m="http://schemas.openxmlformats.org/officeDocument/2006/math" xmlns:v="urn:schemas-microsoft-com:vml" xmlns:wp14="http://schemas.microsoft.com/office/word/2010/wordprocessingDrawing" xmlns:wp="http://schemas.openxmlformats.org/drawingml/2006/wordprocessingDrawing" xmlns:w10="urn:schemas-microsoft-com:office:word" xmlns:w="http://schemas.openxmlformats.org/wordprocessingml/2006/main" xmlns:w14="http://schemas.microsoft.com/office/word/2010/wordml" xmlns:w15="http://schemas.microsoft.com/office/word/2012/wordml" xmlns:wpg="http://schemas.microsoft.com/office/word/2010/wordprocessingGroup" xmlns:wpi="http://schemas.microsoft.com/office/word/2010/wordprocessingInk" xmlns:wne="http://schemas.microsoft.com/office/word/2006/wordml" xmlns:wps="http://schemas.microsoft.com/office/word/2010/wordprocessingShape" mc:Ignorable="w14 w15 wp14">
-  <w:endnote w:type="separator" w:id="-1">
-    <w:p>
-      <w:pPr>
-        <w:spacing w:after="0" w:line="240" w:lineRule="auto"/>
-      </w:pPr>
-      <w:r>
-        <w:rPr>
-          <w:rStyle w:val="EndnoteReference"/>
-        </w:rPr>
-        <w:endnoteRef/>
-      </w:r>
-      <w:r>
-        <w:separator/>
-      </w:r>
-    </w:p>
-  </w:endnote>
-  <w:endnote w:type="continuationSeparator" w:id="0">
-    <w:p>
-      <w:pPr>
-        <w:spacing w:after="0" w:line="240" w:lineRule="auto"/>
-      </w:pPr>
-      <w:r>
-        <w:rPr>
-          <w:rStyle w:val="EndnoteReference"/>
-        </w:rPr>
-        <w:endnoteRef/>
-      </w:r>
-      <w:r>
-        <w:continuationSeparator/>
-      </w:r>
-    </w:p>
-  </w:endnote>
-</w:endnotes>
 </file>
 
 <file path=word/footnotes.xml><?xml version="1.0" encoding="utf-8"?>
@@ -5009,9 +4842,9 @@
   <w:docDefaults>
     <w:rPrDefault>
       <w:rPr>
-        <w:rFonts w:ascii="Calibri" w:cs="Calibri" w:eastAsia="Calibri" w:hAnsi="Calibri"/>
         <w:sz w:val="21"/>
         <w:szCs w:val="21"/>
+        <w:rFonts w:ascii="Calibri" w:cs="Calibri" w:eastAsia="Calibri" w:hAnsi="Calibri"/>
       </w:rPr>
     </w:rPrDefault>
     <w:pPrDefault/>
@@ -5109,8 +4942,8 @@
     <w:uiPriority w:val="99"/>
     <w:unhideWhenUsed/>
     <w:rPr>
+      <w:u w:val="single"/>
       <w:color w:val="0563C1"/>
-      <w:u w:val="single"/>
     </w:rPr>
   </w:style>
   <w:style w:type="character" w:styleId="FootnoteReference">
@@ -5150,42 +4983,5 @@
       <w:szCs w:val="20"/>
     </w:rPr>
   </w:style>
-  <w:style w:type="character" w:styleId="EndnoteReference">
-    <w:name w:val="endnote reference"/>
-    <w:basedOn w:val="DefaultParagraphFont"/>
-    <w:uiPriority w:val="99"/>
-    <w:semiHidden/>
-    <w:unhideWhenUsed/>
-    <w:rPr>
-      <w:vertAlign w:val="superscript"/>
-    </w:rPr>
-  </w:style>
-  <w:style w:type="paragraph" w:styleId="EndnoteText">
-    <w:name w:val="endnote text"/>
-    <w:basedOn w:val="Normal"/>
-    <w:link w:val="EndnoteTextChar"/>
-    <w:uiPriority w:val="99"/>
-    <w:semiHidden/>
-    <w:unhideWhenUsed/>
-    <w:pPr>
-      <w:spacing w:after="0" w:line="240" w:lineRule="auto"/>
-    </w:pPr>
-    <w:rPr>
-      <w:sz w:val="20"/>
-      <w:szCs w:val="20"/>
-    </w:rPr>
-  </w:style>
-  <w:style w:type="character" w:styleId="EndnoteTextChar">
-    <w:name w:val="Endnote Text Char"/>
-    <w:basedOn w:val="DefaultParagraphFont"/>
-    <w:link w:val="EndnoteText"/>
-    <w:uiPriority w:val="99"/>
-    <w:semiHidden/>
-    <w:unhideWhenUsed/>
-    <w:rPr>
-      <w:sz w:val="20"/>
-      <w:szCs w:val="20"/>
-    </w:rPr>
-  </w:style>
 </w:styles>
 </file>
</xml_diff>